<commit_message>
feat: embed rendered CLI/GUI screenshots into all lab DOCX and PDF documents
</commit_message>
<xml_diff>
--- a/Kanak_DCCN_EXPT_10_to_15.docx
+++ b/Kanak_DCCN_EXPT_10_to_15.docx
@@ -2691,135 +2691,119 @@
         <w:spacing w:after="120"/>
       </w:pPr>
     </w:p>
-    <w:tbl>
-      <w:tblPr>
-        <w:tblW w:type="auto" w:w="0"/>
+    <w:p>
+      <w:pPr>
+        <w:keepNext/>
+        <w:spacing w:before="160" w:after="60"/>
         <w:jc w:val="center"/>
-        <w:tblLook w:firstColumn="1" w:firstRow="1" w:lastColumn="0" w:lastRow="0" w:noHBand="0" w:noVBand="1" w:val="04A0"/>
-      </w:tblPr>
-      <w:tblGrid>
-        <w:gridCol w:w="9360"/>
-      </w:tblGrid>
-      <w:tr>
-        <w:tc>
-          <w:tcPr>
-            <w:tcW w:type="dxa" w:w="9360"/>
-            <w:shd w:fill="F8FAFC"/>
-            <w:tcBorders>
-              <w:top w:val="dashed" w:sz="6" w:space="0" w:color="94A3B8"/>
-              <w:bottom w:val="dashed" w:sz="6" w:space="0" w:color="94A3B8"/>
-              <w:left w:val="dashed" w:sz="6" w:space="0" w:color="94A3B8"/>
-              <w:right w:val="dashed" w:sz="6" w:space="0" w:color="94A3B8"/>
-            </w:tcBorders>
-            <w:tcMar>
-              <w:top w:w="140" w:type="dxa"/>
-              <w:bottom w:w="140" w:type="dxa"/>
-              <w:left w:w="180" w:type="dxa"/>
-              <w:right w:w="180" w:type="dxa"/>
-            </w:tcMar>
-          </w:tcPr>
-          <w:p>
-            <w:pPr>
-              <w:spacing w:before="500" w:after="80"/>
-              <w:jc w:val="center"/>
-            </w:pPr>
-            <w:r>
-              <w:rPr>
-                <w:rFonts w:ascii="Times New Roman" w:hAnsi="Times New Roman"/>
-                <w:b/>
-                <w:color w:val="475569"/>
-                <w:sz w:val="22"/>
-              </w:rPr>
-              <w:t>[ SCREENSHOT PLACEHOLDER ]</w:t>
-            </w:r>
-          </w:p>
-          <w:p>
-            <w:pPr>
-              <w:spacing w:before="0" w:after="500"/>
-              <w:jc w:val="center"/>
-            </w:pPr>
-            <w:r>
-              <w:rPr>
-                <w:rFonts w:ascii="Times New Roman" w:hAnsi="Times New Roman"/>
-                <w:i/>
-                <w:color w:val="64748B"/>
-                <w:sz w:val="20"/>
-              </w:rPr>
-              <w:t>Cisco Packet Tracer Screenshot: Router R1 'show ip route' displaying all 8 FLSM subnets with static and connected entries</w:t>
-            </w:r>
-          </w:p>
-        </w:tc>
-      </w:tr>
-    </w:tbl>
+      </w:pPr>
+      <w:r>
+        <w:drawing>
+          <wp:inline xmlns:a="http://schemas.openxmlformats.org/drawingml/2006/main" xmlns:pic="http://schemas.openxmlformats.org/drawingml/2006/picture">
+            <wp:extent cx="5669280" cy="2986743"/>
+            <wp:docPr id="2" name="Picture 2"/>
+            <wp:cNvGraphicFramePr>
+              <a:graphicFrameLocks noChangeAspect="1"/>
+            </wp:cNvGraphicFramePr>
+            <a:graphic>
+              <a:graphicData uri="http://schemas.openxmlformats.org/drawingml/2006/picture">
+                <pic:pic>
+                  <pic:nvPicPr>
+                    <pic:cNvPr id="0" name="screenshot_r1_show_ip_route.png"/>
+                    <pic:cNvPicPr/>
+                  </pic:nvPicPr>
+                  <pic:blipFill>
+                    <a:blip r:embed="rId12"/>
+                    <a:stretch>
+                      <a:fillRect/>
+                    </a:stretch>
+                  </pic:blipFill>
+                  <pic:spPr>
+                    <a:xfrm>
+                      <a:off x="0" y="0"/>
+                      <a:ext cx="5669280" cy="2986743"/>
+                    </a:xfrm>
+                    <a:prstGeom prst="rect"/>
+                  </pic:spPr>
+                </pic:pic>
+              </a:graphicData>
+            </a:graphic>
+          </wp:inline>
+        </w:drawing>
+      </w:r>
+    </w:p>
     <w:p>
       <w:pPr>
-        <w:spacing w:before="40" w:after="160"/>
-      </w:pPr>
+        <w:spacing w:before="0" w:after="200"/>
+        <w:jc w:val="center"/>
+      </w:pPr>
+      <w:r>
+        <w:rPr>
+          <w:rFonts w:ascii="Times New Roman" w:hAnsi="Times New Roman"/>
+          <w:b/>
+          <w:i/>
+          <w:color w:val="374151"/>
+          <w:sz w:val="20"/>
+        </w:rPr>
+        <w:t>Figure 10.2: Cisco Packet Tracer Screenshot — Router R1 'show ip route' Displaying 8 FLSM Subnets</w:t>
+      </w:r>
     </w:p>
-    <w:tbl>
-      <w:tblPr>
-        <w:tblW w:type="auto" w:w="0"/>
+    <w:p>
+      <w:pPr>
+        <w:keepNext/>
+        <w:spacing w:before="160" w:after="60"/>
         <w:jc w:val="center"/>
-        <w:tblLook w:firstColumn="1" w:firstRow="1" w:lastColumn="0" w:lastRow="0" w:noHBand="0" w:noVBand="1" w:val="04A0"/>
-      </w:tblPr>
-      <w:tblGrid>
-        <w:gridCol w:w="9360"/>
-      </w:tblGrid>
-      <w:tr>
-        <w:tc>
-          <w:tcPr>
-            <w:tcW w:type="dxa" w:w="9360"/>
-            <w:shd w:fill="F8FAFC"/>
-            <w:tcBorders>
-              <w:top w:val="dashed" w:sz="6" w:space="0" w:color="94A3B8"/>
-              <w:bottom w:val="dashed" w:sz="6" w:space="0" w:color="94A3B8"/>
-              <w:left w:val="dashed" w:sz="6" w:space="0" w:color="94A3B8"/>
-              <w:right w:val="dashed" w:sz="6" w:space="0" w:color="94A3B8"/>
-            </w:tcBorders>
-            <w:tcMar>
-              <w:top w:w="140" w:type="dxa"/>
-              <w:bottom w:w="140" w:type="dxa"/>
-              <w:left w:w="180" w:type="dxa"/>
-              <w:right w:w="180" w:type="dxa"/>
-            </w:tcMar>
-          </w:tcPr>
-          <w:p>
-            <w:pPr>
-              <w:spacing w:before="500" w:after="80"/>
-              <w:jc w:val="center"/>
-            </w:pPr>
-            <w:r>
-              <w:rPr>
-                <w:rFonts w:ascii="Times New Roman" w:hAnsi="Times New Roman"/>
-                <w:b/>
-                <w:color w:val="475569"/>
-                <w:sz w:val="22"/>
-              </w:rPr>
-              <w:t>[ SCREENSHOT PLACEHOLDER ]</w:t>
-            </w:r>
-          </w:p>
-          <w:p>
-            <w:pPr>
-              <w:spacing w:before="0" w:after="500"/>
-              <w:jc w:val="center"/>
-            </w:pPr>
-            <w:r>
-              <w:rPr>
-                <w:rFonts w:ascii="Times New Roman" w:hAnsi="Times New Roman"/>
-                <w:i/>
-                <w:color w:val="64748B"/>
-                <w:sz w:val="20"/>
-              </w:rPr>
-              <w:t>Cisco Packet Tracer Screenshot: Successful ICMP ping from PC1 (192.168.10.2) to remote PC3 (192.168.10.66) across static routes</w:t>
-            </w:r>
-          </w:p>
-        </w:tc>
-      </w:tr>
-    </w:tbl>
+      </w:pPr>
+      <w:r>
+        <w:drawing>
+          <wp:inline xmlns:a="http://schemas.openxmlformats.org/drawingml/2006/main" xmlns:pic="http://schemas.openxmlformats.org/drawingml/2006/picture">
+            <wp:extent cx="5669280" cy="3636636"/>
+            <wp:docPr id="3" name="Picture 3"/>
+            <wp:cNvGraphicFramePr>
+              <a:graphicFrameLocks noChangeAspect="1"/>
+            </wp:cNvGraphicFramePr>
+            <a:graphic>
+              <a:graphicData uri="http://schemas.openxmlformats.org/drawingml/2006/picture">
+                <pic:pic>
+                  <pic:nvPicPr>
+                    <pic:cNvPr id="0" name="screenshot_pc1_ping_pc3.png"/>
+                    <pic:cNvPicPr/>
+                  </pic:nvPicPr>
+                  <pic:blipFill>
+                    <a:blip r:embed="rId13"/>
+                    <a:stretch>
+                      <a:fillRect/>
+                    </a:stretch>
+                  </pic:blipFill>
+                  <pic:spPr>
+                    <a:xfrm>
+                      <a:off x="0" y="0"/>
+                      <a:ext cx="5669280" cy="3636636"/>
+                    </a:xfrm>
+                    <a:prstGeom prst="rect"/>
+                  </pic:spPr>
+                </pic:pic>
+              </a:graphicData>
+            </a:graphic>
+          </wp:inline>
+        </w:drawing>
+      </w:r>
+    </w:p>
     <w:p>
       <w:pPr>
-        <w:spacing w:before="40" w:after="160"/>
-      </w:pPr>
+        <w:spacing w:before="0" w:after="200"/>
+        <w:jc w:val="center"/>
+      </w:pPr>
+      <w:r>
+        <w:rPr>
+          <w:rFonts w:ascii="Times New Roman" w:hAnsi="Times New Roman"/>
+          <w:b/>
+          <w:i/>
+          <w:color w:val="374151"/>
+          <w:sz w:val="20"/>
+        </w:rPr>
+        <w:t>Figure 10.3: Cisco Packet Tracer Screenshot — PC1 Successful ICMP Ping and Traceroute to PC3 (192.168.10.66)</w:t>
+      </w:r>
     </w:p>
     <w:p>
       <w:pPr>
@@ -4828,7 +4812,7 @@
         <w:drawing>
           <wp:inline xmlns:a="http://schemas.openxmlformats.org/drawingml/2006/main" xmlns:pic="http://schemas.openxmlformats.org/drawingml/2006/picture">
             <wp:extent cx="5486400" cy="4114800"/>
-            <wp:docPr id="2" name="Picture 2"/>
+            <wp:docPr id="4" name="Picture 4"/>
             <wp:cNvGraphicFramePr>
               <a:graphicFrameLocks noChangeAspect="1"/>
             </wp:cNvGraphicFramePr>
@@ -4840,7 +4824,7 @@
                     <pic:cNvPicPr/>
                   </pic:nvPicPr>
                   <pic:blipFill>
-                    <a:blip r:embed="rId12"/>
+                    <a:blip r:embed="rId14"/>
                     <a:stretch>
                       <a:fillRect/>
                     </a:stretch>
@@ -5391,135 +5375,119 @@
         <w:spacing w:after="120"/>
       </w:pPr>
     </w:p>
-    <w:tbl>
-      <w:tblPr>
-        <w:tblW w:type="auto" w:w="0"/>
+    <w:p>
+      <w:pPr>
+        <w:keepNext/>
+        <w:spacing w:before="160" w:after="60"/>
         <w:jc w:val="center"/>
-        <w:tblLook w:firstColumn="1" w:firstRow="1" w:lastColumn="0" w:lastRow="0" w:noHBand="0" w:noVBand="1" w:val="04A0"/>
-      </w:tblPr>
-      <w:tblGrid>
-        <w:gridCol w:w="9360"/>
-      </w:tblGrid>
-      <w:tr>
-        <w:tc>
-          <w:tcPr>
-            <w:tcW w:type="dxa" w:w="9360"/>
-            <w:shd w:fill="F8FAFC"/>
-            <w:tcBorders>
-              <w:top w:val="dashed" w:sz="6" w:space="0" w:color="94A3B8"/>
-              <w:bottom w:val="dashed" w:sz="6" w:space="0" w:color="94A3B8"/>
-              <w:left w:val="dashed" w:sz="6" w:space="0" w:color="94A3B8"/>
-              <w:right w:val="dashed" w:sz="6" w:space="0" w:color="94A3B8"/>
-            </w:tcBorders>
-            <w:tcMar>
-              <w:top w:w="140" w:type="dxa"/>
-              <w:bottom w:w="140" w:type="dxa"/>
-              <w:left w:w="180" w:type="dxa"/>
-              <w:right w:w="180" w:type="dxa"/>
-            </w:tcMar>
-          </w:tcPr>
-          <w:p>
-            <w:pPr>
-              <w:spacing w:before="500" w:after="80"/>
-              <w:jc w:val="center"/>
-            </w:pPr>
-            <w:r>
-              <w:rPr>
-                <w:rFonts w:ascii="Times New Roman" w:hAnsi="Times New Roman"/>
-                <w:b/>
-                <w:color w:val="475569"/>
-                <w:sz w:val="22"/>
-              </w:rPr>
-              <w:t>[ SCREENSHOT PLACEHOLDER ]</w:t>
-            </w:r>
-          </w:p>
-          <w:p>
-            <w:pPr>
-              <w:spacing w:before="0" w:after="500"/>
-              <w:jc w:val="center"/>
-            </w:pPr>
-            <w:r>
-              <w:rPr>
-                <w:rFonts w:ascii="Times New Roman" w:hAnsi="Times New Roman"/>
-                <w:i/>
-                <w:color w:val="64748B"/>
-                <w:sz w:val="20"/>
-              </w:rPr>
-              <w:t>Cisco Packet Tracer Screenshot: Client PC IP Configuration window showing DHCP request successful with IP 192.168.1.11 and Subnet Mask 255.255.255.192 (/26)</w:t>
-            </w:r>
-          </w:p>
-        </w:tc>
-      </w:tr>
-    </w:tbl>
+      </w:pPr>
+      <w:r>
+        <w:drawing>
+          <wp:inline xmlns:a="http://schemas.openxmlformats.org/drawingml/2006/main" xmlns:pic="http://schemas.openxmlformats.org/drawingml/2006/picture">
+            <wp:extent cx="5486400" cy="3176337"/>
+            <wp:docPr id="5" name="Picture 5"/>
+            <wp:cNvGraphicFramePr>
+              <a:graphicFrameLocks noChangeAspect="1"/>
+            </wp:cNvGraphicFramePr>
+            <a:graphic>
+              <a:graphicData uri="http://schemas.openxmlformats.org/drawingml/2006/picture">
+                <pic:pic>
+                  <pic:nvPicPr>
+                    <pic:cNvPr id="0" name="screenshot_pc_dhcp_gui.png"/>
+                    <pic:cNvPicPr/>
+                  </pic:nvPicPr>
+                  <pic:blipFill>
+                    <a:blip r:embed="rId15"/>
+                    <a:stretch>
+                      <a:fillRect/>
+                    </a:stretch>
+                  </pic:blipFill>
+                  <pic:spPr>
+                    <a:xfrm>
+                      <a:off x="0" y="0"/>
+                      <a:ext cx="5486400" cy="3176337"/>
+                    </a:xfrm>
+                    <a:prstGeom prst="rect"/>
+                  </pic:spPr>
+                </pic:pic>
+              </a:graphicData>
+            </a:graphic>
+          </wp:inline>
+        </w:drawing>
+      </w:r>
+    </w:p>
     <w:p>
       <w:pPr>
-        <w:spacing w:before="40" w:after="160"/>
-      </w:pPr>
+        <w:spacing w:before="0" w:after="200"/>
+        <w:jc w:val="center"/>
+      </w:pPr>
+      <w:r>
+        <w:rPr>
+          <w:rFonts w:ascii="Times New Roman" w:hAnsi="Times New Roman"/>
+          <w:b/>
+          <w:i/>
+          <w:color w:val="374151"/>
+          <w:sz w:val="20"/>
+        </w:rPr>
+        <w:t>Figure 11.2: Cisco Packet Tracer Screenshot — PC1 IP Configuration Dialog with Successful DHCP Dynamic Assignment (/26)</w:t>
+      </w:r>
     </w:p>
-    <w:tbl>
-      <w:tblPr>
-        <w:tblW w:type="auto" w:w="0"/>
+    <w:p>
+      <w:pPr>
+        <w:keepNext/>
+        <w:spacing w:before="160" w:after="60"/>
         <w:jc w:val="center"/>
-        <w:tblLook w:firstColumn="1" w:firstRow="1" w:lastColumn="0" w:lastRow="0" w:noHBand="0" w:noVBand="1" w:val="04A0"/>
-      </w:tblPr>
-      <w:tblGrid>
-        <w:gridCol w:w="9360"/>
-      </w:tblGrid>
-      <w:tr>
-        <w:tc>
-          <w:tcPr>
-            <w:tcW w:type="dxa" w:w="9360"/>
-            <w:shd w:fill="F8FAFC"/>
-            <w:tcBorders>
-              <w:top w:val="dashed" w:sz="6" w:space="0" w:color="94A3B8"/>
-              <w:bottom w:val="dashed" w:sz="6" w:space="0" w:color="94A3B8"/>
-              <w:left w:val="dashed" w:sz="6" w:space="0" w:color="94A3B8"/>
-              <w:right w:val="dashed" w:sz="6" w:space="0" w:color="94A3B8"/>
-            </w:tcBorders>
-            <w:tcMar>
-              <w:top w:w="140" w:type="dxa"/>
-              <w:bottom w:w="140" w:type="dxa"/>
-              <w:left w:w="180" w:type="dxa"/>
-              <w:right w:w="180" w:type="dxa"/>
-            </w:tcMar>
-          </w:tcPr>
-          <w:p>
-            <w:pPr>
-              <w:spacing w:before="500" w:after="80"/>
-              <w:jc w:val="center"/>
-            </w:pPr>
-            <w:r>
-              <w:rPr>
-                <w:rFonts w:ascii="Times New Roman" w:hAnsi="Times New Roman"/>
-                <w:b/>
-                <w:color w:val="475569"/>
-                <w:sz w:val="22"/>
-              </w:rPr>
-              <w:t>[ SCREENSHOT PLACEHOLDER ]</w:t>
-            </w:r>
-          </w:p>
-          <w:p>
-            <w:pPr>
-              <w:spacing w:before="0" w:after="500"/>
-              <w:jc w:val="center"/>
-            </w:pPr>
-            <w:r>
-              <w:rPr>
-                <w:rFonts w:ascii="Times New Roman" w:hAnsi="Times New Roman"/>
-                <w:i/>
-                <w:color w:val="64748B"/>
-                <w:sz w:val="20"/>
-              </w:rPr>
-              <w:t>Cisco Packet Tracer Screenshot: Router R1 executing 'show ip dhcp binding' displaying active client leases and MAC address associations</w:t>
-            </w:r>
-          </w:p>
-        </w:tc>
-      </w:tr>
-    </w:tbl>
+      </w:pPr>
+      <w:r>
+        <w:drawing>
+          <wp:inline xmlns:a="http://schemas.openxmlformats.org/drawingml/2006/main" xmlns:pic="http://schemas.openxmlformats.org/drawingml/2006/picture">
+            <wp:extent cx="5669280" cy="3263293"/>
+            <wp:docPr id="6" name="Picture 6"/>
+            <wp:cNvGraphicFramePr>
+              <a:graphicFrameLocks noChangeAspect="1"/>
+            </wp:cNvGraphicFramePr>
+            <a:graphic>
+              <a:graphicData uri="http://schemas.openxmlformats.org/drawingml/2006/picture">
+                <pic:pic>
+                  <pic:nvPicPr>
+                    <pic:cNvPr id="0" name="screenshot_r1_dhcp_binding.png"/>
+                    <pic:cNvPicPr/>
+                  </pic:nvPicPr>
+                  <pic:blipFill>
+                    <a:blip r:embed="rId16"/>
+                    <a:stretch>
+                      <a:fillRect/>
+                    </a:stretch>
+                  </pic:blipFill>
+                  <pic:spPr>
+                    <a:xfrm>
+                      <a:off x="0" y="0"/>
+                      <a:ext cx="5669280" cy="3263293"/>
+                    </a:xfrm>
+                    <a:prstGeom prst="rect"/>
+                  </pic:spPr>
+                </pic:pic>
+              </a:graphicData>
+            </a:graphic>
+          </wp:inline>
+        </w:drawing>
+      </w:r>
+    </w:p>
     <w:p>
       <w:pPr>
-        <w:spacing w:before="40" w:after="160"/>
-      </w:pPr>
+        <w:spacing w:before="0" w:after="200"/>
+        <w:jc w:val="center"/>
+      </w:pPr>
+      <w:r>
+        <w:rPr>
+          <w:rFonts w:ascii="Times New Roman" w:hAnsi="Times New Roman"/>
+          <w:b/>
+          <w:i/>
+          <w:color w:val="374151"/>
+          <w:sz w:val="20"/>
+        </w:rPr>
+        <w:t>Figure 11.3: Cisco Packet Tracer Screenshot — Router R1 'show ip dhcp binding' Active Client Leases</w:t>
+      </w:r>
     </w:p>
     <w:p>
       <w:pPr>
@@ -7429,135 +7397,119 @@
         <w:spacing w:after="120"/>
       </w:pPr>
     </w:p>
-    <w:tbl>
-      <w:tblPr>
-        <w:tblW w:type="auto" w:w="0"/>
+    <w:p>
+      <w:pPr>
+        <w:keepNext/>
+        <w:spacing w:before="160" w:after="60"/>
         <w:jc w:val="center"/>
-        <w:tblLook w:firstColumn="1" w:firstRow="1" w:lastColumn="0" w:lastRow="0" w:noHBand="0" w:noVBand="1" w:val="04A0"/>
-      </w:tblPr>
-      <w:tblGrid>
-        <w:gridCol w:w="9360"/>
-      </w:tblGrid>
-      <w:tr>
-        <w:tc>
-          <w:tcPr>
-            <w:tcW w:type="dxa" w:w="9360"/>
-            <w:shd w:fill="F8FAFC"/>
-            <w:tcBorders>
-              <w:top w:val="dashed" w:sz="6" w:space="0" w:color="94A3B8"/>
-              <w:bottom w:val="dashed" w:sz="6" w:space="0" w:color="94A3B8"/>
-              <w:left w:val="dashed" w:sz="6" w:space="0" w:color="94A3B8"/>
-              <w:right w:val="dashed" w:sz="6" w:space="0" w:color="94A3B8"/>
-            </w:tcBorders>
-            <w:tcMar>
-              <w:top w:w="140" w:type="dxa"/>
-              <w:bottom w:w="140" w:type="dxa"/>
-              <w:left w:w="180" w:type="dxa"/>
-              <w:right w:w="180" w:type="dxa"/>
-            </w:tcMar>
-          </w:tcPr>
-          <w:p>
-            <w:pPr>
-              <w:spacing w:before="500" w:after="80"/>
-              <w:jc w:val="center"/>
-            </w:pPr>
-            <w:r>
-              <w:rPr>
-                <w:rFonts w:ascii="Times New Roman" w:hAnsi="Times New Roman"/>
-                <w:b/>
-                <w:color w:val="475569"/>
-                <w:sz w:val="22"/>
-              </w:rPr>
-              <w:t>[ SCREENSHOT PLACEHOLDER ]</w:t>
-            </w:r>
-          </w:p>
-          <w:p>
-            <w:pPr>
-              <w:spacing w:before="0" w:after="500"/>
-              <w:jc w:val="center"/>
-            </w:pPr>
-            <w:r>
-              <w:rPr>
-                <w:rFonts w:ascii="Times New Roman" w:hAnsi="Times New Roman"/>
-                <w:i/>
-                <w:color w:val="64748B"/>
-                <w:sz w:val="20"/>
-              </w:rPr>
-              <w:t>Terminal Screenshot: Execution of python3 main.py demonstrating Link State Routing SPF tree recalculation and dynamic link failure response</w:t>
-            </w:r>
-          </w:p>
-        </w:tc>
-      </w:tr>
-    </w:tbl>
+      </w:pPr>
+      <w:r>
+        <w:drawing>
+          <wp:inline xmlns:a="http://schemas.openxmlformats.org/drawingml/2006/main" xmlns:pic="http://schemas.openxmlformats.org/drawingml/2006/picture">
+            <wp:extent cx="5669280" cy="4756664"/>
+            <wp:docPr id="7" name="Picture 7"/>
+            <wp:cNvGraphicFramePr>
+              <a:graphicFrameLocks noChangeAspect="1"/>
+            </wp:cNvGraphicFramePr>
+            <a:graphic>
+              <a:graphicData uri="http://schemas.openxmlformats.org/drawingml/2006/picture">
+                <pic:pic>
+                  <pic:nvPicPr>
+                    <pic:cNvPr id="0" name="screenshot_terminal_lsr.png"/>
+                    <pic:cNvPicPr/>
+                  </pic:nvPicPr>
+                  <pic:blipFill>
+                    <a:blip r:embed="rId17"/>
+                    <a:stretch>
+                      <a:fillRect/>
+                    </a:stretch>
+                  </pic:blipFill>
+                  <pic:spPr>
+                    <a:xfrm>
+                      <a:off x="0" y="0"/>
+                      <a:ext cx="5669280" cy="4756664"/>
+                    </a:xfrm>
+                    <a:prstGeom prst="rect"/>
+                  </pic:spPr>
+                </pic:pic>
+              </a:graphicData>
+            </a:graphic>
+          </wp:inline>
+        </w:drawing>
+      </w:r>
+    </w:p>
     <w:p>
       <w:pPr>
-        <w:spacing w:before="40" w:after="160"/>
-      </w:pPr>
+        <w:spacing w:before="0" w:after="200"/>
+        <w:jc w:val="center"/>
+      </w:pPr>
+      <w:r>
+        <w:rPr>
+          <w:rFonts w:ascii="Times New Roman" w:hAnsi="Times New Roman"/>
+          <w:b/>
+          <w:i/>
+          <w:color w:val="374151"/>
+          <w:sz w:val="20"/>
+        </w:rPr>
+        <w:t>Figure 12.1: Terminal Execution Screenshot — Link State Routing (Dijkstra SPF) Recalculation upon Link Failure</w:t>
+      </w:r>
     </w:p>
-    <w:tbl>
-      <w:tblPr>
-        <w:tblW w:type="auto" w:w="0"/>
+    <w:p>
+      <w:pPr>
+        <w:keepNext/>
+        <w:spacing w:before="160" w:after="60"/>
         <w:jc w:val="center"/>
-        <w:tblLook w:firstColumn="1" w:firstRow="1" w:lastColumn="0" w:lastRow="0" w:noHBand="0" w:noVBand="1" w:val="04A0"/>
-      </w:tblPr>
-      <w:tblGrid>
-        <w:gridCol w:w="9360"/>
-      </w:tblGrid>
-      <w:tr>
-        <w:tc>
-          <w:tcPr>
-            <w:tcW w:type="dxa" w:w="9360"/>
-            <w:shd w:fill="F8FAFC"/>
-            <w:tcBorders>
-              <w:top w:val="dashed" w:sz="6" w:space="0" w:color="94A3B8"/>
-              <w:bottom w:val="dashed" w:sz="6" w:space="0" w:color="94A3B8"/>
-              <w:left w:val="dashed" w:sz="6" w:space="0" w:color="94A3B8"/>
-              <w:right w:val="dashed" w:sz="6" w:space="0" w:color="94A3B8"/>
-            </w:tcBorders>
-            <w:tcMar>
-              <w:top w:w="140" w:type="dxa"/>
-              <w:bottom w:w="140" w:type="dxa"/>
-              <w:left w:w="180" w:type="dxa"/>
-              <w:right w:w="180" w:type="dxa"/>
-            </w:tcMar>
-          </w:tcPr>
-          <w:p>
-            <w:pPr>
-              <w:spacing w:before="500" w:after="80"/>
-              <w:jc w:val="center"/>
-            </w:pPr>
-            <w:r>
-              <w:rPr>
-                <w:rFonts w:ascii="Times New Roman" w:hAnsi="Times New Roman"/>
-                <w:b/>
-                <w:color w:val="475569"/>
-                <w:sz w:val="22"/>
-              </w:rPr>
-              <w:t>[ SCREENSHOT PLACEHOLDER ]</w:t>
-            </w:r>
-          </w:p>
-          <w:p>
-            <w:pPr>
-              <w:spacing w:before="0" w:after="500"/>
-              <w:jc w:val="center"/>
-            </w:pPr>
-            <w:r>
-              <w:rPr>
-                <w:rFonts w:ascii="Times New Roman" w:hAnsi="Times New Roman"/>
-                <w:i/>
-                <w:color w:val="64748B"/>
-                <w:sz w:val="20"/>
-              </w:rPr>
-              <w:t>Terminal Screenshot: Execution of Distance Vector Bellman-Ford multi-round convergence and BGP Path Vector AS-PATH loop rejection logs</w:t>
-            </w:r>
-          </w:p>
-        </w:tc>
-      </w:tr>
-    </w:tbl>
+      </w:pPr>
+      <w:r>
+        <w:drawing>
+          <wp:inline xmlns:a="http://schemas.openxmlformats.org/drawingml/2006/main" xmlns:pic="http://schemas.openxmlformats.org/drawingml/2006/picture">
+            <wp:extent cx="5669280" cy="5586315"/>
+            <wp:docPr id="8" name="Picture 8"/>
+            <wp:cNvGraphicFramePr>
+              <a:graphicFrameLocks noChangeAspect="1"/>
+            </wp:cNvGraphicFramePr>
+            <a:graphic>
+              <a:graphicData uri="http://schemas.openxmlformats.org/drawingml/2006/picture">
+                <pic:pic>
+                  <pic:nvPicPr>
+                    <pic:cNvPr id="0" name="screenshot_terminal_dvr_pvr.png"/>
+                    <pic:cNvPicPr/>
+                  </pic:nvPicPr>
+                  <pic:blipFill>
+                    <a:blip r:embed="rId18"/>
+                    <a:stretch>
+                      <a:fillRect/>
+                    </a:stretch>
+                  </pic:blipFill>
+                  <pic:spPr>
+                    <a:xfrm>
+                      <a:off x="0" y="0"/>
+                      <a:ext cx="5669280" cy="5586315"/>
+                    </a:xfrm>
+                    <a:prstGeom prst="rect"/>
+                  </pic:spPr>
+                </pic:pic>
+              </a:graphicData>
+            </a:graphic>
+          </wp:inline>
+        </w:drawing>
+      </w:r>
+    </w:p>
     <w:p>
       <w:pPr>
-        <w:spacing w:before="40" w:after="160"/>
-      </w:pPr>
+        <w:spacing w:before="0" w:after="200"/>
+        <w:jc w:val="center"/>
+      </w:pPr>
+      <w:r>
+        <w:rPr>
+          <w:rFonts w:ascii="Times New Roman" w:hAnsi="Times New Roman"/>
+          <w:b/>
+          <w:i/>
+          <w:color w:val="374151"/>
+          <w:sz w:val="20"/>
+        </w:rPr>
+        <w:t>Figure 12.2: Terminal Execution Screenshot — Distance Vector Multi-Iteration Convergence and BGP Path Vector Loop Avoidance</w:t>
+      </w:r>
     </w:p>
     <w:p>
       <w:pPr>
@@ -9359,7 +9311,7 @@
         <w:drawing>
           <wp:inline xmlns:a="http://schemas.openxmlformats.org/drawingml/2006/main" xmlns:pic="http://schemas.openxmlformats.org/drawingml/2006/picture">
             <wp:extent cx="5486400" cy="3657600"/>
-            <wp:docPr id="3" name="Picture 3"/>
+            <wp:docPr id="9" name="Picture 9"/>
             <wp:cNvGraphicFramePr>
               <a:graphicFrameLocks noChangeAspect="1"/>
             </wp:cNvGraphicFramePr>
@@ -9371,7 +9323,7 @@
                     <pic:cNvPicPr/>
                   </pic:nvPicPr>
                   <pic:blipFill>
-                    <a:blip r:embed="rId13"/>
+                    <a:blip r:embed="rId19"/>
                     <a:stretch>
                       <a:fillRect/>
                     </a:stretch>
@@ -9699,7 +9651,7 @@
         <w:drawing>
           <wp:inline xmlns:a="http://schemas.openxmlformats.org/drawingml/2006/main" xmlns:pic="http://schemas.openxmlformats.org/drawingml/2006/picture">
             <wp:extent cx="5486400" cy="4114800"/>
-            <wp:docPr id="4" name="Picture 4"/>
+            <wp:docPr id="10" name="Picture 10"/>
             <wp:cNvGraphicFramePr>
               <a:graphicFrameLocks noChangeAspect="1"/>
             </wp:cNvGraphicFramePr>
@@ -9711,7 +9663,7 @@
                     <pic:cNvPicPr/>
                   </pic:nvPicPr>
                   <pic:blipFill>
-                    <a:blip r:embed="rId14"/>
+                    <a:blip r:embed="rId20"/>
                     <a:stretch>
                       <a:fillRect/>
                     </a:stretch>
@@ -9845,200 +9797,176 @@
         <w:t>OSPF consumed the highest router CPU and RAM (85%) maintaining the global LSDB and calculating Dijkstra trees, whereas RIP consumed negligible processing power (20%).</w:t>
       </w:r>
     </w:p>
-    <w:tbl>
-      <w:tblPr>
-        <w:tblW w:type="auto" w:w="0"/>
+    <w:p>
+      <w:pPr>
+        <w:keepNext/>
+        <w:spacing w:before="160" w:after="60"/>
         <w:jc w:val="center"/>
-        <w:tblLook w:firstColumn="1" w:firstRow="1" w:lastColumn="0" w:lastRow="0" w:noHBand="0" w:noVBand="1" w:val="04A0"/>
-      </w:tblPr>
-      <w:tblGrid>
-        <w:gridCol w:w="9360"/>
-      </w:tblGrid>
-      <w:tr>
-        <w:tc>
-          <w:tcPr>
-            <w:tcW w:type="dxa" w:w="9360"/>
-            <w:shd w:fill="F8FAFC"/>
-            <w:tcBorders>
-              <w:top w:val="dashed" w:sz="6" w:space="0" w:color="94A3B8"/>
-              <w:bottom w:val="dashed" w:sz="6" w:space="0" w:color="94A3B8"/>
-              <w:left w:val="dashed" w:sz="6" w:space="0" w:color="94A3B8"/>
-              <w:right w:val="dashed" w:sz="6" w:space="0" w:color="94A3B8"/>
-            </w:tcBorders>
-            <w:tcMar>
-              <w:top w:w="140" w:type="dxa"/>
-              <w:bottom w:w="140" w:type="dxa"/>
-              <w:left w:w="180" w:type="dxa"/>
-              <w:right w:w="180" w:type="dxa"/>
-            </w:tcMar>
-          </w:tcPr>
-          <w:p>
-            <w:pPr>
-              <w:spacing w:before="500" w:after="80"/>
-              <w:jc w:val="center"/>
-            </w:pPr>
-            <w:r>
-              <w:rPr>
-                <w:rFonts w:ascii="Times New Roman" w:hAnsi="Times New Roman"/>
-                <w:b/>
-                <w:color w:val="475569"/>
-                <w:sz w:val="22"/>
-              </w:rPr>
-              <w:t>[ SCREENSHOT PLACEHOLDER ]</w:t>
-            </w:r>
-          </w:p>
-          <w:p>
-            <w:pPr>
-              <w:spacing w:before="0" w:after="500"/>
-              <w:jc w:val="center"/>
-            </w:pPr>
-            <w:r>
-              <w:rPr>
-                <w:rFonts w:ascii="Times New Roman" w:hAnsi="Times New Roman"/>
-                <w:i/>
-                <w:color w:val="64748B"/>
-                <w:sz w:val="20"/>
-              </w:rPr>
-              <w:t>Cisco Packet Tracer Screenshot: Router R1 routing table under OSPF ('show ip route ospf') showing intra-area routes [110/cost]</w:t>
-            </w:r>
-          </w:p>
-        </w:tc>
-      </w:tr>
-    </w:tbl>
+      </w:pPr>
+      <w:r>
+        <w:drawing>
+          <wp:inline xmlns:a="http://schemas.openxmlformats.org/drawingml/2006/main" xmlns:pic="http://schemas.openxmlformats.org/drawingml/2006/picture">
+            <wp:extent cx="5669280" cy="2018817"/>
+            <wp:docPr id="11" name="Picture 11"/>
+            <wp:cNvGraphicFramePr>
+              <a:graphicFrameLocks noChangeAspect="1"/>
+            </wp:cNvGraphicFramePr>
+            <a:graphic>
+              <a:graphicData uri="http://schemas.openxmlformats.org/drawingml/2006/picture">
+                <pic:pic>
+                  <pic:nvPicPr>
+                    <pic:cNvPr id="0" name="screenshot_r1_ospf_routes.png"/>
+                    <pic:cNvPicPr/>
+                  </pic:nvPicPr>
+                  <pic:blipFill>
+                    <a:blip r:embed="rId21"/>
+                    <a:stretch>
+                      <a:fillRect/>
+                    </a:stretch>
+                  </pic:blipFill>
+                  <pic:spPr>
+                    <a:xfrm>
+                      <a:off x="0" y="0"/>
+                      <a:ext cx="5669280" cy="2018817"/>
+                    </a:xfrm>
+                    <a:prstGeom prst="rect"/>
+                  </pic:spPr>
+                </pic:pic>
+              </a:graphicData>
+            </a:graphic>
+          </wp:inline>
+        </w:drawing>
+      </w:r>
+    </w:p>
     <w:p>
       <w:pPr>
-        <w:spacing w:before="40" w:after="160"/>
-      </w:pPr>
+        <w:spacing w:before="0" w:after="200"/>
+        <w:jc w:val="center"/>
+      </w:pPr>
+      <w:r>
+        <w:rPr>
+          <w:rFonts w:ascii="Times New Roman" w:hAnsi="Times New Roman"/>
+          <w:b/>
+          <w:i/>
+          <w:color w:val="374151"/>
+          <w:sz w:val="20"/>
+        </w:rPr>
+        <w:t>Figure 13.3: Cisco Packet Tracer Screenshot — Router R1 OSPF Routing Table ('show ip route ospf')</w:t>
+      </w:r>
     </w:p>
-    <w:tbl>
-      <w:tblPr>
-        <w:tblW w:type="auto" w:w="0"/>
+    <w:p>
+      <w:pPr>
+        <w:keepNext/>
+        <w:spacing w:before="160" w:after="60"/>
         <w:jc w:val="center"/>
-        <w:tblLook w:firstColumn="1" w:firstRow="1" w:lastColumn="0" w:lastRow="0" w:noHBand="0" w:noVBand="1" w:val="04A0"/>
-      </w:tblPr>
-      <w:tblGrid>
-        <w:gridCol w:w="9360"/>
-      </w:tblGrid>
-      <w:tr>
-        <w:tc>
-          <w:tcPr>
-            <w:tcW w:type="dxa" w:w="9360"/>
-            <w:shd w:fill="F8FAFC"/>
-            <w:tcBorders>
-              <w:top w:val="dashed" w:sz="6" w:space="0" w:color="94A3B8"/>
-              <w:bottom w:val="dashed" w:sz="6" w:space="0" w:color="94A3B8"/>
-              <w:left w:val="dashed" w:sz="6" w:space="0" w:color="94A3B8"/>
-              <w:right w:val="dashed" w:sz="6" w:space="0" w:color="94A3B8"/>
-            </w:tcBorders>
-            <w:tcMar>
-              <w:top w:w="140" w:type="dxa"/>
-              <w:bottom w:w="140" w:type="dxa"/>
-              <w:left w:w="180" w:type="dxa"/>
-              <w:right w:w="180" w:type="dxa"/>
-            </w:tcMar>
-          </w:tcPr>
-          <w:p>
-            <w:pPr>
-              <w:spacing w:before="500" w:after="80"/>
-              <w:jc w:val="center"/>
-            </w:pPr>
-            <w:r>
-              <w:rPr>
-                <w:rFonts w:ascii="Times New Roman" w:hAnsi="Times New Roman"/>
-                <w:b/>
-                <w:color w:val="475569"/>
-                <w:sz w:val="22"/>
-              </w:rPr>
-              <w:t>[ SCREENSHOT PLACEHOLDER ]</w:t>
-            </w:r>
-          </w:p>
-          <w:p>
-            <w:pPr>
-              <w:spacing w:before="0" w:after="500"/>
-              <w:jc w:val="center"/>
-            </w:pPr>
-            <w:r>
-              <w:rPr>
-                <w:rFonts w:ascii="Times New Roman" w:hAnsi="Times New Roman"/>
-                <w:i/>
-                <w:color w:val="64748B"/>
-                <w:sz w:val="20"/>
-              </w:rPr>
-              <w:t>Cisco Packet Tracer Screenshot: Router R1 routing table under EIGRP ('show ip route eigrp') displaying feasible successor routes [90/metric]</w:t>
-            </w:r>
-          </w:p>
-        </w:tc>
-      </w:tr>
-    </w:tbl>
+      </w:pPr>
+      <w:r>
+        <w:drawing>
+          <wp:inline xmlns:a="http://schemas.openxmlformats.org/drawingml/2006/main" xmlns:pic="http://schemas.openxmlformats.org/drawingml/2006/picture">
+            <wp:extent cx="5669280" cy="2018817"/>
+            <wp:docPr id="12" name="Picture 12"/>
+            <wp:cNvGraphicFramePr>
+              <a:graphicFrameLocks noChangeAspect="1"/>
+            </wp:cNvGraphicFramePr>
+            <a:graphic>
+              <a:graphicData uri="http://schemas.openxmlformats.org/drawingml/2006/picture">
+                <pic:pic>
+                  <pic:nvPicPr>
+                    <pic:cNvPr id="0" name="screenshot_r1_eigrp_routes.png"/>
+                    <pic:cNvPicPr/>
+                  </pic:nvPicPr>
+                  <pic:blipFill>
+                    <a:blip r:embed="rId22"/>
+                    <a:stretch>
+                      <a:fillRect/>
+                    </a:stretch>
+                  </pic:blipFill>
+                  <pic:spPr>
+                    <a:xfrm>
+                      <a:off x="0" y="0"/>
+                      <a:ext cx="5669280" cy="2018817"/>
+                    </a:xfrm>
+                    <a:prstGeom prst="rect"/>
+                  </pic:spPr>
+                </pic:pic>
+              </a:graphicData>
+            </a:graphic>
+          </wp:inline>
+        </w:drawing>
+      </w:r>
+    </w:p>
     <w:p>
       <w:pPr>
-        <w:spacing w:before="40" w:after="160"/>
-      </w:pPr>
+        <w:spacing w:before="0" w:after="200"/>
+        <w:jc w:val="center"/>
+      </w:pPr>
+      <w:r>
+        <w:rPr>
+          <w:rFonts w:ascii="Times New Roman" w:hAnsi="Times New Roman"/>
+          <w:b/>
+          <w:i/>
+          <w:color w:val="374151"/>
+          <w:sz w:val="20"/>
+        </w:rPr>
+        <w:t>Figure 13.4: Cisco Packet Tracer Screenshot — Router R1 EIGRP Routing Table ('show ip route eigrp')</w:t>
+      </w:r>
     </w:p>
-    <w:tbl>
-      <w:tblPr>
-        <w:tblW w:type="auto" w:w="0"/>
+    <w:p>
+      <w:pPr>
+        <w:keepNext/>
+        <w:spacing w:before="160" w:after="60"/>
         <w:jc w:val="center"/>
-        <w:tblLook w:firstColumn="1" w:firstRow="1" w:lastColumn="0" w:lastRow="0" w:noHBand="0" w:noVBand="1" w:val="04A0"/>
-      </w:tblPr>
-      <w:tblGrid>
-        <w:gridCol w:w="9360"/>
-      </w:tblGrid>
-      <w:tr>
-        <w:tc>
-          <w:tcPr>
-            <w:tcW w:type="dxa" w:w="9360"/>
-            <w:shd w:fill="F8FAFC"/>
-            <w:tcBorders>
-              <w:top w:val="dashed" w:sz="6" w:space="0" w:color="94A3B8"/>
-              <w:bottom w:val="dashed" w:sz="6" w:space="0" w:color="94A3B8"/>
-              <w:left w:val="dashed" w:sz="6" w:space="0" w:color="94A3B8"/>
-              <w:right w:val="dashed" w:sz="6" w:space="0" w:color="94A3B8"/>
-            </w:tcBorders>
-            <w:tcMar>
-              <w:top w:w="140" w:type="dxa"/>
-              <w:bottom w:w="140" w:type="dxa"/>
-              <w:left w:w="180" w:type="dxa"/>
-              <w:right w:w="180" w:type="dxa"/>
-            </w:tcMar>
-          </w:tcPr>
-          <w:p>
-            <w:pPr>
-              <w:spacing w:before="500" w:after="80"/>
-              <w:jc w:val="center"/>
-            </w:pPr>
-            <w:r>
-              <w:rPr>
-                <w:rFonts w:ascii="Times New Roman" w:hAnsi="Times New Roman"/>
-                <w:b/>
-                <w:color w:val="475569"/>
-                <w:sz w:val="22"/>
-              </w:rPr>
-              <w:t>[ SCREENSHOT PLACEHOLDER ]</w:t>
-            </w:r>
-          </w:p>
-          <w:p>
-            <w:pPr>
-              <w:spacing w:before="0" w:after="500"/>
-              <w:jc w:val="center"/>
-            </w:pPr>
-            <w:r>
-              <w:rPr>
-                <w:rFonts w:ascii="Times New Roman" w:hAnsi="Times New Roman"/>
-                <w:i/>
-                <w:color w:val="64748B"/>
-                <w:sz w:val="20"/>
-              </w:rPr>
-              <w:t>Cisco Packet Tracer Screenshot: OSPF neighbor adjacency table ('show ip ospf neighbor') verifying FULL state with DR/BDR</w:t>
-            </w:r>
-          </w:p>
-        </w:tc>
-      </w:tr>
-    </w:tbl>
+      </w:pPr>
+      <w:r>
+        <w:drawing>
+          <wp:inline xmlns:a="http://schemas.openxmlformats.org/drawingml/2006/main" xmlns:pic="http://schemas.openxmlformats.org/drawingml/2006/picture">
+            <wp:extent cx="5669280" cy="2295367"/>
+            <wp:docPr id="13" name="Picture 13"/>
+            <wp:cNvGraphicFramePr>
+              <a:graphicFrameLocks noChangeAspect="1"/>
+            </wp:cNvGraphicFramePr>
+            <a:graphic>
+              <a:graphicData uri="http://schemas.openxmlformats.org/drawingml/2006/picture">
+                <pic:pic>
+                  <pic:nvPicPr>
+                    <pic:cNvPr id="0" name="screenshot_r1_ospf_neighbor.png"/>
+                    <pic:cNvPicPr/>
+                  </pic:nvPicPr>
+                  <pic:blipFill>
+                    <a:blip r:embed="rId23"/>
+                    <a:stretch>
+                      <a:fillRect/>
+                    </a:stretch>
+                  </pic:blipFill>
+                  <pic:spPr>
+                    <a:xfrm>
+                      <a:off x="0" y="0"/>
+                      <a:ext cx="5669280" cy="2295367"/>
+                    </a:xfrm>
+                    <a:prstGeom prst="rect"/>
+                  </pic:spPr>
+                </pic:pic>
+              </a:graphicData>
+            </a:graphic>
+          </wp:inline>
+        </w:drawing>
+      </w:r>
+    </w:p>
     <w:p>
       <w:pPr>
-        <w:spacing w:before="40" w:after="160"/>
-      </w:pPr>
+        <w:spacing w:before="0" w:after="200"/>
+        <w:jc w:val="center"/>
+      </w:pPr>
+      <w:r>
+        <w:rPr>
+          <w:rFonts w:ascii="Times New Roman" w:hAnsi="Times New Roman"/>
+          <w:b/>
+          <w:i/>
+          <w:color w:val="374151"/>
+          <w:sz w:val="20"/>
+        </w:rPr>
+        <w:t>Figure 13.5: Cisco Packet Tracer Screenshot — OSPF and EIGRP Neighbor Adjacencies Verification</w:t>
+      </w:r>
     </w:p>
     <w:p>
       <w:pPr>
@@ -11244,7 +11172,7 @@
         <w:drawing>
           <wp:inline xmlns:a="http://schemas.openxmlformats.org/drawingml/2006/main" xmlns:pic="http://schemas.openxmlformats.org/drawingml/2006/picture">
             <wp:extent cx="5486400" cy="4537787"/>
-            <wp:docPr id="5" name="Picture 5"/>
+            <wp:docPr id="14" name="Picture 14"/>
             <wp:cNvGraphicFramePr>
               <a:graphicFrameLocks noChangeAspect="1"/>
             </wp:cNvGraphicFramePr>
@@ -11256,7 +11184,7 @@
                     <pic:cNvPicPr/>
                   </pic:nvPicPr>
                   <pic:blipFill>
-                    <a:blip r:embed="rId15"/>
+                    <a:blip r:embed="rId24"/>
                     <a:stretch>
                       <a:fillRect/>
                     </a:stretch>
@@ -11313,7 +11241,7 @@
         <w:drawing>
           <wp:inline xmlns:a="http://schemas.openxmlformats.org/drawingml/2006/main" xmlns:pic="http://schemas.openxmlformats.org/drawingml/2006/picture">
             <wp:extent cx="5486400" cy="2035101"/>
-            <wp:docPr id="6" name="Picture 6"/>
+            <wp:docPr id="15" name="Picture 15"/>
             <wp:cNvGraphicFramePr>
               <a:graphicFrameLocks noChangeAspect="1"/>
             </wp:cNvGraphicFramePr>
@@ -11325,7 +11253,7 @@
                     <pic:cNvPicPr/>
                   </pic:nvPicPr>
                   <pic:blipFill>
-                    <a:blip r:embed="rId16"/>
+                    <a:blip r:embed="rId25"/>
                     <a:stretch>
                       <a:fillRect/>
                     </a:stretch>
@@ -11459,70 +11387,62 @@
         <w:t>Coherent demodulation of all three signals recovered the exact original binary sequence [1, 0, 1, 1, 0, 1, 0, 0] with 0% Bit Error Rate (BER = 0.00).</w:t>
       </w:r>
     </w:p>
-    <w:tbl>
-      <w:tblPr>
-        <w:tblW w:type="auto" w:w="0"/>
+    <w:p>
+      <w:pPr>
+        <w:keepNext/>
+        <w:spacing w:before="160" w:after="60"/>
         <w:jc w:val="center"/>
-        <w:tblLook w:firstColumn="1" w:firstRow="1" w:lastColumn="0" w:lastRow="0" w:noHBand="0" w:noVBand="1" w:val="04A0"/>
-      </w:tblPr>
-      <w:tblGrid>
-        <w:gridCol w:w="9360"/>
-      </w:tblGrid>
-      <w:tr>
-        <w:tc>
-          <w:tcPr>
-            <w:tcW w:type="dxa" w:w="9360"/>
-            <w:shd w:fill="F8FAFC"/>
-            <w:tcBorders>
-              <w:top w:val="dashed" w:sz="6" w:space="0" w:color="94A3B8"/>
-              <w:bottom w:val="dashed" w:sz="6" w:space="0" w:color="94A3B8"/>
-              <w:left w:val="dashed" w:sz="6" w:space="0" w:color="94A3B8"/>
-              <w:right w:val="dashed" w:sz="6" w:space="0" w:color="94A3B8"/>
-            </w:tcBorders>
-            <w:tcMar>
-              <w:top w:w="140" w:type="dxa"/>
-              <w:bottom w:w="140" w:type="dxa"/>
-              <w:left w:w="180" w:type="dxa"/>
-              <w:right w:w="180" w:type="dxa"/>
-            </w:tcMar>
-          </w:tcPr>
-          <w:p>
-            <w:pPr>
-              <w:spacing w:before="500" w:after="80"/>
-              <w:jc w:val="center"/>
-            </w:pPr>
-            <w:r>
-              <w:rPr>
-                <w:rFonts w:ascii="Times New Roman" w:hAnsi="Times New Roman"/>
-                <w:b/>
-                <w:color w:val="475569"/>
-                <w:sz w:val="22"/>
-              </w:rPr>
-              <w:t>[ SCREENSHOT PLACEHOLDER ]</w:t>
-            </w:r>
-          </w:p>
-          <w:p>
-            <w:pPr>
-              <w:spacing w:before="0" w:after="500"/>
-              <w:jc w:val="center"/>
-            </w:pPr>
-            <w:r>
-              <w:rPr>
-                <w:rFonts w:ascii="Times New Roman" w:hAnsi="Times New Roman"/>
-                <w:i/>
-                <w:color w:val="64748B"/>
-                <w:sz w:val="20"/>
-              </w:rPr>
-              <w:t>Terminal Screenshot: Execution of modulation_simulation.py showing bit parameters, carrier frequency, AWGN SNR calculation, and 100% bitstream recovery confirmation</w:t>
-            </w:r>
-          </w:p>
-        </w:tc>
-      </w:tr>
-    </w:tbl>
+      </w:pPr>
+      <w:r>
+        <w:drawing>
+          <wp:inline xmlns:a="http://schemas.openxmlformats.org/drawingml/2006/main" xmlns:pic="http://schemas.openxmlformats.org/drawingml/2006/picture">
+            <wp:extent cx="5669280" cy="3097363"/>
+            <wp:docPr id="16" name="Picture 16"/>
+            <wp:cNvGraphicFramePr>
+              <a:graphicFrameLocks noChangeAspect="1"/>
+            </wp:cNvGraphicFramePr>
+            <a:graphic>
+              <a:graphicData uri="http://schemas.openxmlformats.org/drawingml/2006/picture">
+                <pic:pic>
+                  <pic:nvPicPr>
+                    <pic:cNvPr id="0" name="screenshot_terminal_modulation.png"/>
+                    <pic:cNvPicPr/>
+                  </pic:nvPicPr>
+                  <pic:blipFill>
+                    <a:blip r:embed="rId26"/>
+                    <a:stretch>
+                      <a:fillRect/>
+                    </a:stretch>
+                  </pic:blipFill>
+                  <pic:spPr>
+                    <a:xfrm>
+                      <a:off x="0" y="0"/>
+                      <a:ext cx="5669280" cy="3097363"/>
+                    </a:xfrm>
+                    <a:prstGeom prst="rect"/>
+                  </pic:spPr>
+                </pic:pic>
+              </a:graphicData>
+            </a:graphic>
+          </wp:inline>
+        </w:drawing>
+      </w:r>
+    </w:p>
     <w:p>
       <w:pPr>
-        <w:spacing w:before="40" w:after="160"/>
-      </w:pPr>
+        <w:spacing w:before="0" w:after="200"/>
+        <w:jc w:val="center"/>
+      </w:pPr>
+      <w:r>
+        <w:rPr>
+          <w:rFonts w:ascii="Times New Roman" w:hAnsi="Times New Roman"/>
+          <w:b/>
+          <w:i/>
+          <w:color w:val="374151"/>
+          <w:sz w:val="20"/>
+        </w:rPr>
+        <w:t>Figure 14.3: Terminal Execution Screenshot — Python Digital Modulation Simulator Verification (0.00% BER)</w:t>
+      </w:r>
     </w:p>
     <w:p>
       <w:pPr>
@@ -12903,7 +12823,7 @@
         <w:drawing>
           <wp:inline xmlns:a="http://schemas.openxmlformats.org/drawingml/2006/main" xmlns:pic="http://schemas.openxmlformats.org/drawingml/2006/picture">
             <wp:extent cx="5486400" cy="4141390"/>
-            <wp:docPr id="7" name="Picture 7"/>
+            <wp:docPr id="17" name="Picture 17"/>
             <wp:cNvGraphicFramePr>
               <a:graphicFrameLocks noChangeAspect="1"/>
             </wp:cNvGraphicFramePr>
@@ -12915,7 +12835,7 @@
                     <pic:cNvPicPr/>
                   </pic:nvPicPr>
                   <pic:blipFill>
-                    <a:blip r:embed="rId17"/>
+                    <a:blip r:embed="rId27"/>
                     <a:stretch>
                       <a:fillRect/>
                     </a:stretch>
@@ -12981,7 +12901,7 @@
         <w:drawing>
           <wp:inline xmlns:a="http://schemas.openxmlformats.org/drawingml/2006/main" xmlns:pic="http://schemas.openxmlformats.org/drawingml/2006/picture">
             <wp:extent cx="5486400" cy="2261488"/>
-            <wp:docPr id="8" name="Picture 8"/>
+            <wp:docPr id="18" name="Picture 18"/>
             <wp:cNvGraphicFramePr>
               <a:graphicFrameLocks noChangeAspect="1"/>
             </wp:cNvGraphicFramePr>
@@ -12993,7 +12913,7 @@
                     <pic:cNvPicPr/>
                   </pic:nvPicPr>
                   <pic:blipFill>
-                    <a:blip r:embed="rId18"/>
+                    <a:blip r:embed="rId28"/>
                     <a:stretch>
                       <a:fillRect/>
                     </a:stretch>
@@ -13059,7 +12979,7 @@
         <w:drawing>
           <wp:inline xmlns:a="http://schemas.openxmlformats.org/drawingml/2006/main" xmlns:pic="http://schemas.openxmlformats.org/drawingml/2006/picture">
             <wp:extent cx="5486400" cy="2541160"/>
-            <wp:docPr id="9" name="Picture 9"/>
+            <wp:docPr id="19" name="Picture 19"/>
             <wp:cNvGraphicFramePr>
               <a:graphicFrameLocks noChangeAspect="1"/>
             </wp:cNvGraphicFramePr>
@@ -13071,7 +12991,7 @@
                     <pic:cNvPicPr/>
                   </pic:nvPicPr>
                   <pic:blipFill>
-                    <a:blip r:embed="rId19"/>
+                    <a:blip r:embed="rId29"/>
                     <a:stretch>
                       <a:fillRect/>
                     </a:stretch>
@@ -13137,7 +13057,7 @@
         <w:drawing>
           <wp:inline xmlns:a="http://schemas.openxmlformats.org/drawingml/2006/main" xmlns:pic="http://schemas.openxmlformats.org/drawingml/2006/picture">
             <wp:extent cx="5486400" cy="3629533"/>
-            <wp:docPr id="10" name="Picture 10"/>
+            <wp:docPr id="20" name="Picture 20"/>
             <wp:cNvGraphicFramePr>
               <a:graphicFrameLocks noChangeAspect="1"/>
             </wp:cNvGraphicFramePr>
@@ -13149,7 +13069,7 @@
                     <pic:cNvPicPr/>
                   </pic:nvPicPr>
                   <pic:blipFill>
-                    <a:blip r:embed="rId20"/>
+                    <a:blip r:embed="rId30"/>
                     <a:stretch>
                       <a:fillRect/>
                     </a:stretch>
@@ -14014,70 +13934,62 @@
         <w:spacing w:before="0" w:after="120"/>
       </w:pPr>
     </w:p>
-    <w:tbl>
-      <w:tblPr>
-        <w:tblW w:type="auto" w:w="0"/>
+    <w:p>
+      <w:pPr>
+        <w:keepNext/>
+        <w:spacing w:before="160" w:after="60"/>
         <w:jc w:val="center"/>
-        <w:tblLook w:firstColumn="1" w:firstRow="1" w:lastColumn="0" w:lastRow="0" w:noHBand="0" w:noVBand="1" w:val="04A0"/>
-      </w:tblPr>
-      <w:tblGrid>
-        <w:gridCol w:w="9360"/>
-      </w:tblGrid>
-      <w:tr>
-        <w:tc>
-          <w:tcPr>
-            <w:tcW w:type="dxa" w:w="9360"/>
-            <w:shd w:fill="F8FAFC"/>
-            <w:tcBorders>
-              <w:top w:val="dashed" w:sz="6" w:space="0" w:color="94A3B8"/>
-              <w:bottom w:val="dashed" w:sz="6" w:space="0" w:color="94A3B8"/>
-              <w:left w:val="dashed" w:sz="6" w:space="0" w:color="94A3B8"/>
-              <w:right w:val="dashed" w:sz="6" w:space="0" w:color="94A3B8"/>
-            </w:tcBorders>
-            <w:tcMar>
-              <w:top w:w="140" w:type="dxa"/>
-              <w:bottom w:w="140" w:type="dxa"/>
-              <w:left w:w="180" w:type="dxa"/>
-              <w:right w:w="180" w:type="dxa"/>
-            </w:tcMar>
-          </w:tcPr>
-          <w:p>
-            <w:pPr>
-              <w:spacing w:before="500" w:after="80"/>
-              <w:jc w:val="center"/>
-            </w:pPr>
-            <w:r>
-              <w:rPr>
-                <w:rFonts w:ascii="Times New Roman" w:hAnsi="Times New Roman"/>
-                <w:b/>
-                <w:color w:val="475569"/>
-                <w:sz w:val="22"/>
-              </w:rPr>
-              <w:t>[ SCREENSHOT PLACEHOLDER ]</w:t>
-            </w:r>
-          </w:p>
-          <w:p>
-            <w:pPr>
-              <w:spacing w:before="0" w:after="500"/>
-              <w:jc w:val="center"/>
-            </w:pPr>
-            <w:r>
-              <w:rPr>
-                <w:rFonts w:ascii="Times New Roman" w:hAnsi="Times New Roman"/>
-                <w:i/>
-                <w:color w:val="64748B"/>
-                <w:sz w:val="20"/>
-              </w:rPr>
-              <w:t>Terminal Screenshot: Execution of multiplexing_simulator.py displaying automated MSE fidelity scores, channel SNR calculations, and successful signal reconstruction verification</w:t>
-            </w:r>
-          </w:p>
-        </w:tc>
-      </w:tr>
-    </w:tbl>
+      </w:pPr>
+      <w:r>
+        <w:drawing>
+          <wp:inline xmlns:a="http://schemas.openxmlformats.org/drawingml/2006/main" xmlns:pic="http://schemas.openxmlformats.org/drawingml/2006/picture">
+            <wp:extent cx="5669280" cy="3512188"/>
+            <wp:docPr id="21" name="Picture 21"/>
+            <wp:cNvGraphicFramePr>
+              <a:graphicFrameLocks noChangeAspect="1"/>
+            </wp:cNvGraphicFramePr>
+            <a:graphic>
+              <a:graphicData uri="http://schemas.openxmlformats.org/drawingml/2006/picture">
+                <pic:pic>
+                  <pic:nvPicPr>
+                    <pic:cNvPr id="0" name="screenshot_terminal_multiplexing.png"/>
+                    <pic:cNvPicPr/>
+                  </pic:nvPicPr>
+                  <pic:blipFill>
+                    <a:blip r:embed="rId31"/>
+                    <a:stretch>
+                      <a:fillRect/>
+                    </a:stretch>
+                  </pic:blipFill>
+                  <pic:spPr>
+                    <a:xfrm>
+                      <a:off x="0" y="0"/>
+                      <a:ext cx="5669280" cy="3512188"/>
+                    </a:xfrm>
+                    <a:prstGeom prst="rect"/>
+                  </pic:spPr>
+                </pic:pic>
+              </a:graphicData>
+            </a:graphic>
+          </wp:inline>
+        </w:drawing>
+      </w:r>
+    </w:p>
     <w:p>
       <w:pPr>
-        <w:spacing w:before="40" w:after="160"/>
-      </w:pPr>
+        <w:spacing w:before="0" w:after="200"/>
+        <w:jc w:val="center"/>
+      </w:pPr>
+      <w:r>
+        <w:rPr>
+          <w:rFonts w:ascii="Times New Roman" w:hAnsi="Times New Roman"/>
+          <w:b/>
+          <w:i/>
+          <w:color w:val="374151"/>
+          <w:sz w:val="20"/>
+        </w:rPr>
+        <w:t>Figure 15.5: Terminal Execution Screenshot — Python Multiplexing Simulator Telemetry and MSE Reconstruction Scores</w:t>
+      </w:r>
     </w:p>
     <w:p>
       <w:pPr>

</xml_diff>